<commit_message>
fix: align standard template paragraph rhythm
</commit_message>
<xml_diff>
--- a/examples/地热温泉资源开发利用规范.docx
+++ b/examples/地热温泉资源开发利用规范.docx
@@ -13592,6 +13592,7 @@
       <w:autoSpaceDN w:val="0"/>
       <w:ind w:firstLine="200" w:firstLineChars="200"/>
       <w:jc w:val="both"/>
+      <w:spacing w:before="0" w:after="0" w:line="400" w:lineRule="exact"/>
     </w:pPr>
     <w:rPr>
       <w:rFonts w:ascii="宋体" w:hAnsi="Times New Roman" w:eastAsia="宋体" w:cs="Times New Roman"/>
@@ -13711,6 +13712,7 @@
         <w:ilvl w:val="0"/>
         <w:numId w:val="1"/>
       </w:numPr>
+      <w:spacing w:before="0" w:after="0" w:line="400" w:lineRule="exact"/>
     </w:pPr>
     <w:rPr>
       <w:rFonts w:ascii="宋体" w:hAnsi="Times New Roman" w:eastAsia="宋体" w:cs="Times New Roman"/>
@@ -13727,7 +13729,7 @@
         <w:ilvl w:val="3"/>
         <w:numId w:val="2"/>
       </w:numPr>
-      <w:spacing w:before="50" w:beforeLines="50" w:after="50" w:afterLines="50"/>
+      <w:spacing w:before="50" w:beforeLines="50" w:after="50" w:afterLines="50" w:line="400" w:lineRule="exact"/>
       <w:jc w:val="both"/>
       <w:outlineLvl w:val="2"/>
     </w:pPr>
@@ -13899,7 +13901,7 @@
       </w:numPr>
       <w:adjustRightInd w:val="0"/>
       <w:snapToGrid w:val="0"/>
-      <w:spacing w:before="50" w:beforeLines="50" w:after="50" w:afterLines="50"/>
+      <w:spacing w:before="50" w:beforeLines="50" w:after="50" w:afterLines="50" w:line="400" w:lineRule="exact"/>
       <w:jc w:val="center"/>
       <w:textAlignment w:val="baseline"/>
     </w:pPr>
@@ -14019,7 +14021,7 @@
       </w:numPr>
       <w:adjustRightInd w:val="0"/>
       <w:snapToGrid w:val="0"/>
-      <w:spacing w:before="50" w:beforeLines="50" w:after="50" w:afterLines="50"/>
+      <w:spacing w:before="50" w:beforeLines="50" w:after="50" w:afterLines="50" w:line="400" w:lineRule="exact"/>
       <w:jc w:val="center"/>
     </w:pPr>
     <w:rPr>
@@ -14163,6 +14165,7 @@
       </w:numPr>
       <w:adjustRightInd w:val="0"/>
       <w:snapToGrid w:val="0"/>
+      <w:spacing w:before="0" w:after="0" w:line="400" w:lineRule="exact"/>
     </w:pPr>
     <w:rPr>
       <w:rFonts w:ascii="Times New Roman" w:hAnsi="Times New Roman" w:eastAsia="宋体" w:cs="Times New Roman"/>
@@ -14178,6 +14181,7 @@
       <w:numPr>
         <w:numId w:val="10"/>
       </w:numPr>
+      <w:spacing w:before="0" w:after="0" w:line="400" w:lineRule="exact"/>
     </w:pPr>
   </w:style>
   <w:style w:type="paragraph" w:customStyle="1" w:styleId="94">
@@ -14191,6 +14195,7 @@
         <w:ilvl w:val="4"/>
       </w:numPr>
       <w:outlineLvl w:val="3"/>
+      <w:spacing w:before="50" w:after="50" w:line="400" w:lineRule="exact"/>
     </w:pPr>
   </w:style>
   <w:style w:type="character" w:customStyle="1" w:styleId="95">
@@ -14226,6 +14231,7 @@
         <w:numId w:val="11"/>
       </w:numPr>
       <w:jc w:val="both"/>
+      <w:spacing w:before="0" w:after="0" w:line="400" w:lineRule="exact"/>
     </w:pPr>
     <w:rPr>
       <w:rFonts w:ascii="宋体" w:hAnsi="宋体" w:eastAsia="宋体" w:cs="Times New Roman"/>
@@ -14243,7 +14249,7 @@
         <w:ilvl w:val="5"/>
         <w:numId w:val="2"/>
       </w:numPr>
-      <w:spacing w:before="50" w:beforeLines="50" w:after="50" w:afterLines="50"/>
+      <w:spacing w:before="50" w:beforeLines="50" w:after="50" w:afterLines="50" w:line="400" w:lineRule="exact"/>
       <w:jc w:val="both"/>
       <w:outlineLvl w:val="4"/>
     </w:pPr>
@@ -14317,7 +14323,7 @@
         <w:ilvl w:val="6"/>
         <w:numId w:val="2"/>
       </w:numPr>
-      <w:spacing w:before="50" w:beforeLines="50" w:after="50" w:afterLines="50"/>
+      <w:spacing w:before="50" w:beforeLines="50" w:after="50" w:afterLines="50" w:line="400" w:lineRule="exact"/>
       <w:jc w:val="both"/>
       <w:outlineLvl w:val="5"/>
     </w:pPr>
@@ -14336,7 +14342,7 @@
         <w:ilvl w:val="1"/>
         <w:numId w:val="2"/>
       </w:numPr>
-      <w:spacing w:before="100" w:beforeLines="100" w:after="100" w:afterLines="100"/>
+      <w:spacing w:before="240" w:after="240" w:line="400" w:lineRule="exact"/>
       <w:jc w:val="both"/>
       <w:outlineLvl w:val="0"/>
     </w:pPr>
@@ -14355,7 +14361,7 @@
       <w:numPr>
         <w:ilvl w:val="2"/>
       </w:numPr>
-      <w:spacing w:before="50" w:beforeLines="50" w:after="50" w:afterLines="50"/>
+      <w:spacing w:before="50" w:beforeLines="50" w:after="50" w:afterLines="50" w:line="400" w:lineRule="exact"/>
       <w:outlineLvl w:val="1"/>
     </w:pPr>
   </w:style>
@@ -14411,6 +14417,7 @@
         <w:numId w:val="13"/>
       </w:numPr>
       <w:jc w:val="both"/>
+      <w:spacing w:before="0" w:after="0" w:line="400" w:lineRule="exact"/>
     </w:pPr>
     <w:rPr>
       <w:rFonts w:ascii="宋体" w:hAnsi="Times New Roman" w:eastAsia="宋体" w:cs="Times New Roman"/>
@@ -14476,7 +14483,7 @@
       <w:tabs>
         <w:tab w:val="left" w:pos="0"/>
       </w:tabs>
-      <w:spacing w:before="50" w:beforeLines="50" w:after="50" w:afterLines="50"/>
+      <w:spacing w:before="50" w:beforeLines="50" w:after="50" w:afterLines="50" w:line="400" w:lineRule="exact"/>
       <w:jc w:val="center"/>
     </w:pPr>
     <w:rPr>
@@ -14510,7 +14517,7 @@
         <w:ilvl w:val="0"/>
         <w:numId w:val="17"/>
       </w:numPr>
-      <w:spacing w:before="50" w:beforeLines="50" w:after="50" w:afterLines="50"/>
+      <w:spacing w:before="50" w:beforeLines="50" w:after="50" w:afterLines="50" w:line="400" w:lineRule="exact"/>
       <w:jc w:val="center"/>
     </w:pPr>
     <w:rPr>
@@ -14562,6 +14569,7 @@
         <w:ilvl w:val="2"/>
         <w:numId w:val="13"/>
       </w:numPr>
+      <w:spacing w:before="0" w:after="0" w:line="400" w:lineRule="exact"/>
     </w:pPr>
     <w:rPr>
       <w:rFonts w:ascii="宋体" w:hAnsi="Times New Roman" w:eastAsia="宋体" w:cs="Times New Roman"/>
@@ -15180,7 +15188,7 @@
     <w:qFormat/>
     <w:uiPriority w:val="0"/>
     <w:pPr>
-      <w:spacing w:before="0" w:beforeLines="0" w:after="0" w:afterLines="0"/>
+      <w:spacing w:before="0" w:beforeLines="0" w:after="0" w:afterLines="0" w:line="400" w:lineRule="exact"/>
       <w:outlineLvl w:val="9"/>
     </w:pPr>
     <w:rPr>
@@ -15193,7 +15201,7 @@
     <w:qFormat/>
     <w:uiPriority w:val="0"/>
     <w:pPr>
-      <w:spacing w:before="0" w:beforeLines="0" w:after="0" w:afterLines="0"/>
+      <w:spacing w:before="0" w:beforeLines="0" w:after="0" w:afterLines="0" w:line="400" w:lineRule="exact"/>
       <w:outlineLvl w:val="9"/>
     </w:pPr>
     <w:rPr>
@@ -15206,7 +15214,7 @@
     <w:qFormat/>
     <w:uiPriority w:val="0"/>
     <w:pPr>
-      <w:spacing w:before="0" w:beforeLines="0" w:after="0" w:afterLines="0"/>
+      <w:spacing w:before="0" w:beforeLines="0" w:after="0" w:afterLines="0" w:line="400" w:lineRule="exact"/>
       <w:outlineLvl w:val="9"/>
     </w:pPr>
     <w:rPr>
@@ -15219,7 +15227,7 @@
     <w:qFormat/>
     <w:uiPriority w:val="0"/>
     <w:pPr>
-      <w:spacing w:before="0" w:beforeLines="0" w:after="0" w:afterLines="0"/>
+      <w:spacing w:before="0" w:beforeLines="0" w:after="0" w:afterLines="0" w:line="400" w:lineRule="exact"/>
       <w:outlineLvl w:val="9"/>
     </w:pPr>
     <w:rPr>
@@ -15242,7 +15250,7 @@
     <w:qFormat/>
     <w:uiPriority w:val="0"/>
     <w:pPr>
-      <w:spacing w:before="0" w:beforeLines="0" w:after="0" w:afterLines="0"/>
+      <w:spacing w:before="0" w:beforeLines="0" w:after="0" w:afterLines="0" w:line="400" w:lineRule="exact"/>
       <w:outlineLvl w:val="9"/>
     </w:pPr>
     <w:rPr>
@@ -15348,6 +15356,7 @@
         <w:numId w:val="13"/>
       </w:numPr>
       <w:jc w:val="both"/>
+      <w:spacing w:before="0" w:after="0" w:line="400" w:lineRule="exact"/>
     </w:pPr>
     <w:rPr>
       <w:rFonts w:ascii="宋体" w:hAnsi="Times New Roman" w:eastAsia="宋体" w:cs="Times New Roman"/>
@@ -15429,6 +15438,7 @@
       <w:autoSpaceDE w:val="0"/>
       <w:autoSpaceDN w:val="0"/>
       <w:jc w:val="both"/>
+      <w:spacing w:before="0" w:after="0" w:line="300" w:lineRule="exact"/>
     </w:pPr>
     <w:rPr>
       <w:rFonts w:ascii="宋体" w:hAnsi="Times New Roman" w:eastAsia="宋体" w:cs="Times New Roman"/>
@@ -15449,6 +15459,7 @@
       <w:autoSpaceDE w:val="0"/>
       <w:autoSpaceDN w:val="0"/>
       <w:jc w:val="both"/>
+      <w:spacing w:before="0" w:after="0" w:line="300" w:lineRule="exact"/>
     </w:pPr>
     <w:rPr>
       <w:rFonts w:ascii="宋体" w:hAnsi="Times New Roman" w:eastAsia="宋体" w:cs="Times New Roman"/>
@@ -15468,6 +15479,7 @@
         <w:numId w:val="28"/>
       </w:numPr>
       <w:jc w:val="both"/>
+      <w:spacing w:before="0" w:after="0" w:line="400" w:lineRule="exact"/>
     </w:pPr>
     <w:rPr>
       <w:rFonts w:ascii="宋体" w:hAnsi="Times New Roman" w:eastAsia="宋体" w:cs="Times New Roman"/>
@@ -15483,6 +15495,7 @@
     <w:uiPriority w:val="0"/>
     <w:pPr>
       <w:ind w:firstLine="420"/>
+      <w:spacing w:before="0" w:after="0" w:line="400" w:lineRule="exact"/>
     </w:pPr>
     <w:rPr>
       <w:sz w:val="18"/>
@@ -16056,6 +16069,9 @@
     <w:next w:val="56"/>
     <w:qFormat/>
     <w:uiPriority w:val="0"/>
+    <w:pPr>
+      <w:spacing w:before="0" w:after="0" w:line="400" w:lineRule="exact"/>
+    </w:pPr>
   </w:style>
   <w:style w:type="paragraph" w:customStyle="1" w:styleId="224">
     <w:name w:val="标准文件_术语条二"/>
@@ -16063,6 +16079,9 @@
     <w:next w:val="56"/>
     <w:qFormat/>
     <w:uiPriority w:val="0"/>
+    <w:pPr>
+      <w:spacing w:before="0" w:after="0" w:line="400" w:lineRule="exact"/>
+    </w:pPr>
   </w:style>
   <w:style w:type="paragraph" w:customStyle="1" w:styleId="225">
     <w:name w:val="标准文件_术语条三"/>

</xml_diff>